<commit_message>
Point scope document at the new CaviNet_V1 implementation repository
Co-Authored-By: Claude Opus 5.5 <noreply@anthropic.com>
Claude-Session: https://claude.ai/code/session_013iTGVf5WMU2eF4zsHi6p6q
</commit_message>
<xml_diff>
--- a/docs/scope/CaviNet_Scope_Document_v2.docx
+++ b/docs/scope/CaviNet_Scope_Document_v2.docx
@@ -773,7 +773,7 @@
               <w:spacing w:after="40"/>
             </w:pPr>
             <w:r>
-              <w:t xml:space="preserve">Revised after dataset investigation: no public cavity annotations exist for the chosen dataset. Objective changed to TB vs NTM differentiation with a calibrated confidence score. Added PRD-level requirements and a 12-phase implementation plan executed by Claude Code.</w:t>
+              <w:t xml:space="preserve">Revised after dataset investigation: no public cavity annotations exist for the chosen dataset. Objective changed to TB vs NTM differentiation with a calibrated confidence score. Added PRD-level requirements and a 12-phase implementation plan executed by Claude Code. Implementation repository: github.com/ahmadraza225/CaviNet_V1.</w:t>
             </w:r>
           </w:p>
         </w:tc>
@@ -13928,7 +13928,7 @@
         <w:pStyle w:val="Heading2"/>
       </w:pPr>
       <w:r>
-        <w:t xml:space="preserve">14.1 Repository Layout (github.com/ahmadraza225/CaviNet)</w:t>
+        <w:t xml:space="preserve">14.1 Repository Layout (github.com/ahmadraza225/CaviNet_V1)</w:t>
       </w:r>
     </w:p>
     <w:tbl>
@@ -14272,55 +14272,13 @@
               <w:spacing w:after="40"/>
             </w:pPr>
             <w:r>
-              <w:t xml:space="preserve">legacy/</w:t>
+              <w:t xml:space="preserve">docker-compose.yml, Makefile, .env.example</w:t>
             </w:r>
           </w:p>
         </w:tc>
         <w:tc>
           <w:tcPr>
             <w:tcW w:type="dxa" w:w="6319"/>
-            <w:tcMar>
-              <w:top w:type="dxa" w:w="60"/>
-              <w:left w:type="dxa" w:w="100"/>
-              <w:bottom w:type="dxa" w:w="60"/>
-              <w:right w:type="dxa" w:w="100"/>
-            </w:tcMar>
-          </w:tcPr>
-          <w:p>
-            <w:pPr>
-              <w:spacing w:after="40"/>
-            </w:pPr>
-            <w:r>
-              <w:t xml:space="preserve">Earlier Streamlit prototype files, kept for reference</w:t>
-            </w:r>
-          </w:p>
-        </w:tc>
-      </w:tr>
-      <w:tr>
-        <w:tc>
-          <w:tcPr>
-            <w:tcW w:type="dxa" w:w="2707"/>
-            <w:shd w:fill="F7F9FC" w:color="auto" w:val="clear"/>
-            <w:tcMar>
-              <w:top w:type="dxa" w:w="60"/>
-              <w:left w:type="dxa" w:w="100"/>
-              <w:bottom w:type="dxa" w:w="60"/>
-              <w:right w:type="dxa" w:w="100"/>
-            </w:tcMar>
-          </w:tcPr>
-          <w:p>
-            <w:pPr>
-              <w:spacing w:after="40"/>
-            </w:pPr>
-            <w:r>
-              <w:t xml:space="preserve">docker-compose.yml, Makefile, .env.example</w:t>
-            </w:r>
-          </w:p>
-        </w:tc>
-        <w:tc>
-          <w:tcPr>
-            <w:tcW w:type="dxa" w:w="6319"/>
-            <w:shd w:fill="F7F9FC" w:color="auto" w:val="clear"/>
             <w:tcMar>
               <w:top w:type="dxa" w:w="60"/>
               <w:left w:type="dxa" w:w="100"/>
@@ -14416,6 +14374,7 @@
         <w:tc>
           <w:tcPr>
             <w:tcW w:type="dxa" w:w="2707"/>
+            <w:shd w:fill="F7F9FC" w:color="auto" w:val="clear"/>
             <w:tcMar>
               <w:top w:type="dxa" w:w="60"/>
               <w:left w:type="dxa" w:w="100"/>
@@ -14435,6 +14394,7 @@
         <w:tc>
           <w:tcPr>
             <w:tcW w:type="dxa" w:w="6319"/>
+            <w:shd w:fill="F7F9FC" w:color="auto" w:val="clear"/>
             <w:tcMar>
               <w:top w:type="dxa" w:w="60"/>
               <w:left w:type="dxa" w:w="100"/>
@@ -16150,7 +16110,7 @@
         <w:spacing w:after="60"/>
       </w:pPr>
       <w:r>
-        <w:t xml:space="preserve">Move the old Streamlit prototype files (README content, pipeline/, requirements.txt) into legacy/; keep scripts/ and docs/.</w:t>
+        <w:t xml:space="preserve">Start from the clean CaviNet_V1 repository, which already contains docs/scope/, docs/audit/ and scripts/ (keep them). The earlier Streamlit prototype stays in the old CaviNet repository and is not copied.</w:t>
       </w:r>
     </w:p>
     <w:p>
@@ -16359,7 +16319,7 @@
         <w:spacing w:after="60"/>
       </w:pPr>
       <w:r>
-        <w:t xml:space="preserve">Legacy files are in legacy/ and the new README describes the v2.0 project.</w:t>
+        <w:t xml:space="preserve">The new README describes the v2.0 project and links to docs/scope/CaviNet_Scope_Document_v2.md.</w:t>
       </w:r>
     </w:p>
     <w:p>
@@ -16539,22 +16499,22 @@
           <w:sz w:val="18"/>
           <w:szCs w:val="18"/>
         </w:rPr>
-        <w:t xml:space="preserve">1. Move README.md (old Streamlit content), pipeline/ and requirements.txt into</w:t>
-      </w:r>
-    </w:p>
-    <w:p>
-      <w:pPr>
-        <w:shd w:fill="F2F2F2" w:color="auto" w:val="clear"/>
-        <w:spacing w:after="0" w:line="260"/>
-        <w:ind w:left="80" w:right="80"/>
-      </w:pPr>
-      <w:r>
-        <w:rPr>
-          <w:rFonts w:ascii="Consolas" w:cs="Consolas" w:eastAsia="Consolas" w:hAnsi="Consolas"/>
-          <w:sz w:val="18"/>
-          <w:szCs w:val="18"/>
-        </w:rPr>
-        <w:t xml:space="preserve">   legacy/. Keep scripts/ and docs/ where they are.</w:t>
+        <w:t xml:space="preserve">1. The repository already contains docs/scope/, docs/audit/ and scripts/.</w:t>
+      </w:r>
+    </w:p>
+    <w:p>
+      <w:pPr>
+        <w:shd w:fill="F2F2F2" w:color="auto" w:val="clear"/>
+        <w:spacing w:after="0" w:line="260"/>
+        <w:ind w:left="80" w:right="80"/>
+      </w:pPr>
+      <w:r>
+        <w:rPr>
+          <w:rFonts w:ascii="Consolas" w:cs="Consolas" w:eastAsia="Consolas" w:hAnsi="Consolas"/>
+          <w:sz w:val="18"/>
+          <w:szCs w:val="18"/>
+        </w:rPr>
+        <w:t xml:space="preserve">   Keep them unchanged; replace the placeholder README.md in step 7.</w:t>
       </w:r>
     </w:p>
     <w:p>

</xml_diff>